<commit_message>
fix(orders): nominal kecil (<1000) kini tercatat + util pemisah produk/nominal
- isAmountToken: token murni angka dianggap nominal (mis. 250); nama produk berangka (1b/2u) tetap aman

- konfirmasi OCR menerima nominal berapapun

- tambah logging alur OCR + tes
</commit_message>
<xml_diff>
--- a/PANDUAN_BOT.docx
+++ b/PANDUAN_BOT.docx
@@ -1354,6 +1354,46 @@
         <w:spacing w:before="0" w:after="100"/>
       </w:pPr>
       <w:r>
+        <w:t xml:space="preserve">Pencatatan pendapatan otomatis:</w:t>
+      </w:r>
+    </w:p>
+    <w:p>
+      <w:pPr>
+        <w:spacing w:before="0" w:after="60"/>
+      </w:pPr>
+      <w:r>
+        <w:t xml:space="preserve">•  .d 50000 - kirim status selesai SEKALIGUS mencatat pendapatan Rp50.000 (sebaiknya reply chat pelanggan).</w:t>
+      </w:r>
+    </w:p>
+    <w:p>
+      <w:pPr>
+        <w:spacing w:before="0" w:after="60"/>
+      </w:pPr>
+      <w:r>
+        <w:t xml:space="preserve">•  .d Netflix 50k - sama, sekaligus menyimpan nama produk.</w:t>
+      </w:r>
+    </w:p>
+    <w:p>
+      <w:pPr>
+        <w:spacing w:before="0" w:after="60"/>
+      </w:pPr>
+      <w:r>
+        <w:t xml:space="preserve">•  .d (reply foto bukti transfer) - bot membaca nominal dari foto, lalu meminta konfirmasi.</w:t>
+      </w:r>
+    </w:p>
+    <w:p>
+      <w:pPr>
+        <w:spacing w:before="0" w:after="60"/>
+      </w:pPr>
+      <w:r>
+        <w:t xml:space="preserve">•  .setnominal &lt;angka&gt; - mengoreksi nominal pesanan terakhir bila salah input.</w:t>
+      </w:r>
+    </w:p>
+    <w:p>
+      <w:pPr>
+        <w:spacing w:before="0" w:after="100"/>
+      </w:pPr>
+      <w:r>
         <w:t xml:space="preserve">Mengatur template:</w:t>
       </w:r>
     </w:p>
@@ -1505,6 +1545,14 @@
     </w:p>
     <w:p>
       <w:pPr>
+        <w:spacing w:before="0" w:after="100"/>
+      </w:pPr>
+      <w:r>
+        <w:t xml:space="preserve">Jadwal otomatis (masih dalam pengembangan - lihat bagian 11):</w:t>
+      </w:r>
+    </w:p>
+    <w:p>
+      <w:pPr>
         <w:spacing w:before="0" w:after="60"/>
       </w:pPr>
       <w:r>
@@ -1537,42 +1585,146 @@
     </w:p>
     <w:p>
       <w:pPr>
-        <w:spacing w:before="0" w:after="60"/>
-      </w:pPr>
-      <w:r>
-        <w:t xml:space="preserve">•  .dataorder on|off - mengaktifkan/mematikan laporan order otomatis.</w:t>
-      </w:r>
-    </w:p>
-    <w:p>
-      <w:pPr>
-        <w:spacing w:before="0" w:after="60"/>
-      </w:pPr>
-      <w:r>
-        <w:t xml:space="preserve">•  .dataordernow - laporan order hari ini.</w:t>
-      </w:r>
-    </w:p>
-    <w:p>
-      <w:pPr>
-        <w:spacing w:before="0" w:after="60"/>
-      </w:pPr>
-      <w:r>
-        <w:t xml:space="preserve">•  .dataorderlast - laporan order kemarin.</w:t>
-      </w:r>
-    </w:p>
-    <w:p>
-      <w:pPr>
-        <w:spacing w:before="0" w:after="60"/>
-      </w:pPr>
-      <w:r>
-        <w:t xml:space="preserve">•  .dataorderhelp - bantuan data order.</w:t>
-      </w:r>
-    </w:p>
-    <w:p>
-      <w:pPr>
-        <w:spacing w:before="0" w:after="100"/>
-      </w:pPr>
-      <w:r>
-        <w:t xml:space="preserve">(Catatan: fitur ini masih dalam tahap pengembangan - lihat bagian 11.)</w:t>
+        <w:spacing w:before="0" w:after="0"/>
+      </w:pPr>
+      <w:r>
+        <w:t xml:space="preserve"/>
+      </w:r>
+    </w:p>
+    <w:p>
+      <w:pPr>
+        <w:spacing w:before="0" w:after="100"/>
+      </w:pPr>
+      <w:r>
+        <w:t xml:space="preserve">Data Order &amp; Pendapatan (SUDAH AKTIF):</w:t>
+      </w:r>
+    </w:p>
+    <w:p>
+      <w:pPr>
+        <w:spacing w:before="0" w:after="60"/>
+      </w:pPr>
+      <w:r>
+        <w:t xml:space="preserve">•  .dataorder on|off - bila ON, bot otomatis mengirim ringkasan order hari ini setiap kali .close.</w:t>
+      </w:r>
+    </w:p>
+    <w:p>
+      <w:pPr>
+        <w:spacing w:before="0" w:after="60"/>
+      </w:pPr>
+      <w:r>
+        <w:t xml:space="preserve">•  .dataordernow - menampilkan laporan order HARI INI (jumlah order + total pendapatan).</w:t>
+      </w:r>
+    </w:p>
+    <w:p>
+      <w:pPr>
+        <w:spacing w:before="0" w:after="60"/>
+      </w:pPr>
+      <w:r>
+        <w:t xml:space="preserve">•  .dataorderlast - menampilkan laporan order KEMARIN.</w:t>
+      </w:r>
+    </w:p>
+    <w:p>
+      <w:pPr>
+        <w:spacing w:before="0" w:after="60"/>
+      </w:pPr>
+      <w:r>
+        <w:t xml:space="preserve">•  .dataorderhelp - panduan singkat data order.</w:t>
+      </w:r>
+    </w:p>
+    <w:p>
+      <w:pPr>
+        <w:spacing w:before="0" w:after="60"/>
+      </w:pPr>
+      <w:r>
+        <w:t xml:space="preserve">•  .setnominal &lt;angka&gt; - mengoreksi nominal pesanan terakhir.</w:t>
+      </w:r>
+    </w:p>
+    <w:p>
+      <w:pPr>
+        <w:spacing w:before="0" w:after="0"/>
+      </w:pPr>
+      <w:r>
+        <w:t xml:space="preserve"/>
+      </w:r>
+    </w:p>
+    <w:p>
+      <w:pPr>
+        <w:spacing w:before="0" w:after="100"/>
+      </w:pPr>
+      <w:r>
+        <w:t xml:space="preserve">Cara bot menghitung pendapatan:</w:t>
+      </w:r>
+    </w:p>
+    <w:p>
+      <w:pPr>
+        <w:spacing w:before="0" w:after="60"/>
+      </w:pPr>
+      <w:r>
+        <w:t xml:space="preserve">•  Bot TIDAK menebak pendapatan dari chat biasa. Pendapatan hanya dihitung dari pesanan yang DICATAT admin.</w:t>
+      </w:r>
+    </w:p>
+    <w:p>
+      <w:pPr>
+        <w:spacing w:before="0" w:after="60"/>
+      </w:pPr>
+      <w:r>
+        <w:t xml:space="preserve">•  Mencatat pesanan ada 3 cara:</w:t>
+      </w:r>
+    </w:p>
+    <w:p>
+      <w:pPr>
+        <w:spacing w:before="0" w:after="100"/>
+      </w:pPr>
+      <w:r>
+        <w:t xml:space="preserve">  1) .done 50000 - catat Rp50.000 (reply chat pembeli agar nama pembeli ikut tersimpan).</w:t>
+      </w:r>
+    </w:p>
+    <w:p>
+      <w:pPr>
+        <w:spacing w:before="0" w:after="100"/>
+      </w:pPr>
+      <w:r>
+        <w:t xml:space="preserve">  2) .done Netflix 50k - catat produk "Netflix" seharga Rp50.000.</w:t>
+      </w:r>
+    </w:p>
+    <w:p>
+      <w:pPr>
+        <w:spacing w:before="0" w:after="100"/>
+      </w:pPr>
+      <w:r>
+        <w:t xml:space="preserve">  3) .done sambil reply FOTO bukti transfer - bot memakai OCR untuk membaca nominal dari foto, lalu menampilkan hasilnya dan meminta konfirmasi. Balas "ya" untuk menyimpan, atau ketik nominal yang benar (contoh: 50000). Ketik "batal" untuk membatalkan.</w:t>
+      </w:r>
+    </w:p>
+    <w:p>
+      <w:pPr>
+        <w:spacing w:before="0" w:after="60"/>
+      </w:pPr>
+      <w:r>
+        <w:t xml:space="preserve">•  Angka yang didukung: 250, 50000, 50.000, Rp50.000, 50k, 50rb, 1jt, 1,5jt (berapapun, termasuk nominal kecil).</w:t>
+      </w:r>
+    </w:p>
+    <w:p>
+      <w:pPr>
+        <w:spacing w:before="0" w:after="60"/>
+      </w:pPr>
+      <w:r>
+        <w:t xml:space="preserve">•  Letakkan nominal di AKHIR pesan, contoh: ".done canva 1b 250". Kata terakhir yang murni angka dianggap nominal, sehingga nama produk seperti "netflix 2u" atau "canva 1b" tidak salah dianggap nominal.</w:t>
+      </w:r>
+    </w:p>
+    <w:p>
+      <w:pPr>
+        <w:spacing w:before="0" w:after="60"/>
+      </w:pPr>
+      <w:r>
+        <w:t xml:space="preserve">•  Setiap pesanan disimpan dengan tanggal operasional (zona waktu bot), sehingga laporan harian akurat.</w:t>
+      </w:r>
+    </w:p>
+    <w:p>
+      <w:pPr>
+        <w:spacing w:before="0" w:after="60"/>
+      </w:pPr>
+      <w:r>
+        <w:t xml:space="preserve">•  Batas OCR: kualitas pembacaan tergantung kejelasan foto. Bila gagal terbaca, admin cukup mengetik nominal manual.</w:t>
       </w:r>
     </w:p>
     <w:p>
@@ -2247,15 +2399,23 @@
         <w:spacing w:before="0" w:after="60"/>
       </w:pPr>
       <w:r>
-        <w:t xml:space="preserve">•  5. Setelah transaksi selesai, admin me-reply chat pelanggan lalu mengetik .d (atau .done) untuk status "selesai".</w:t>
-      </w:r>
-    </w:p>
-    <w:p>
-      <w:pPr>
-        <w:spacing w:before="0" w:after="60"/>
-      </w:pPr>
-      <w:r>
-        <w:t xml:space="preserve">•  6. Jika toko ingin istirahat: admin mengetik .close untuk menutup grup, dan .open untuk membuka kembali.</w:t>
+        <w:t xml:space="preserve">•  5. Setelah transaksi selesai, admin me-reply chat pelanggan lalu mengetik .d 50000 (dengan nominal) ATAU .d sambil reply foto bukti transfer, agar pesanan tercatat untuk laporan pendapatan.</w:t>
+      </w:r>
+    </w:p>
+    <w:p>
+      <w:pPr>
+        <w:spacing w:before="0" w:after="60"/>
+      </w:pPr>
+      <w:r>
+        <w:t xml:space="preserve">•  6. Admin bisa mengecek pendapatan kapan saja dengan .dataordernow (hari ini) atau .dataorderlast (kemarin).</w:t>
+      </w:r>
+    </w:p>
+    <w:p>
+      <w:pPr>
+        <w:spacing w:before="0" w:after="60"/>
+      </w:pPr>
+      <w:r>
+        <w:t xml:space="preserve">•  7. Jika toko ingin istirahat: admin mengetik .close untuk menutup grup (bila .dataorder ON, ringkasan hari ini ikut terkirim), dan .open untuk membuka kembali.</w:t>
       </w:r>
     </w:p>
     <w:p>
@@ -2486,23 +2646,23 @@
         <w:spacing w:before="0" w:after="60"/>
       </w:pPr>
       <w:r>
-        <w:t xml:space="preserve">•  .dataorder on/off, .dataordernow, .dataorderlast - laporan PDF belum aktif.</w:t>
-      </w:r>
-    </w:p>
-    <w:p>
-      <w:pPr>
-        <w:spacing w:before="0" w:after="60"/>
-      </w:pPr>
-      <w:r>
         <w:t xml:space="preserve">•  .setppgc - belum benar-benar mengubah foto profil grup.</w:t>
       </w:r>
     </w:p>
     <w:p>
       <w:pPr>
-        <w:spacing w:before="0" w:after="100"/>
-      </w:pPr>
-      <w:r>
-        <w:t xml:space="preserve">Fitur yang sudah berfungsi penuh antara lain: menu, sewa, katalog (tambah/ubah/rename/hapus + foto), import/export katalog, template proses/done/open/close/welcome/goodbye, open/close grup, hidetag, kick/promote/demote/add, link/reset link, deletemsg, anti-private-chat, dan notifikasi sewa otomatis.</w:t>
+        <w:spacing w:before="0" w:after="60"/>
+      </w:pPr>
+      <w:r>
+        <w:t xml:space="preserve">•  Laporan .dataordernow/.dataorderlast berformat TEKS (belum berupa PDF).</w:t>
+      </w:r>
+    </w:p>
+    <w:p>
+      <w:pPr>
+        <w:spacing w:before="0" w:after="100"/>
+      </w:pPr>
+      <w:r>
+        <w:t xml:space="preserve">Fitur yang sudah berfungsi penuh antara lain: menu, sewa, katalog (tambah/ubah/rename/hapus + foto), import/export katalog, template proses/done/open/close/welcome/goodbye, open/close grup, hidetag, kick/promote/demote/add, link/reset link, deletemsg, anti-private-chat, data order &amp; pendapatan (pencatatan otomatis + OCR bukti transfer + laporan harian), dan notifikasi sewa otomatis.</w:t>
       </w:r>
     </w:p>
     <w:p>

</xml_diff>

<commit_message>
docs: regenerasi PANDUAN_BOT.docx (fitur blacklist, jadwal auto, setppgc, laporan PDF)
</commit_message>
<xml_diff>
--- a/PANDUAN_BOT.docx
+++ b/PANDUAN_BOT.docx
@@ -1548,7 +1548,7 @@
         <w:spacing w:before="0" w:after="100"/>
       </w:pPr>
       <w:r>
-        <w:t xml:space="preserve">Jadwal otomatis (masih dalam pengembangan - lihat bagian 11):</w:t>
+        <w:t xml:space="preserve">Jadwal otomatis (SUDAH AKTIF):</w:t>
       </w:r>
     </w:p>
     <w:p>
@@ -1585,6 +1585,22 @@
     </w:p>
     <w:p>
       <w:pPr>
+        <w:spacing w:before="0" w:after="100"/>
+      </w:pPr>
+      <w:r>
+        <w:t xml:space="preserve">Cara kerja: bot memeriksa jadwal setiap menit. Saat jam cocok, grup dibuka/ditutup otomatis memakai template open/close. Setiap jadwal hanya berjalan sekali per hari. Bot harus admin grup agar jadwal dapat dijalankan.</w:t>
+      </w:r>
+    </w:p>
+    <w:p>
+      <w:pPr>
+        <w:spacing w:before="0" w:after="100"/>
+      </w:pPr>
+      <w:r>
+        <w:t xml:space="preserve">Melihat status: ketik .autoopen atau .autoclose tanpa argumen untuk melihat status &amp; jam yang tersimpan.</w:t>
+      </w:r>
+    </w:p>
+    <w:p>
+      <w:pPr>
         <w:spacing w:before="0" w:after="0"/>
       </w:pPr>
       <w:r>
@@ -1612,15 +1628,15 @@
         <w:spacing w:before="0" w:after="60"/>
       </w:pPr>
       <w:r>
-        <w:t xml:space="preserve">•  .dataordernow - menampilkan laporan order HARI INI (jumlah order + total pendapatan).</w:t>
-      </w:r>
-    </w:p>
-    <w:p>
-      <w:pPr>
-        <w:spacing w:before="0" w:after="60"/>
-      </w:pPr>
-      <w:r>
-        <w:t xml:space="preserve">•  .dataorderlast - menampilkan laporan order KEMARIN.</w:t>
+        <w:t xml:space="preserve">•  .dataordernow - mengirim laporan order HARI INI sebagai FILE PDF (2 kolom, 15 order per halaman A4).</w:t>
+      </w:r>
+    </w:p>
+    <w:p>
+      <w:pPr>
+        <w:spacing w:before="0" w:after="60"/>
+      </w:pPr>
+      <w:r>
+        <w:t xml:space="preserve">•  .dataorderlast - mengirim laporan order KEMARIN sebagai PDF.</w:t>
       </w:r>
     </w:p>
     <w:p>
@@ -2051,7 +2067,7 @@
         <w:spacing w:before="0" w:after="100"/>
       </w:pPr>
       <w:r>
-        <w:t xml:space="preserve">(Catatan: fitur ini masih dalam tahap pengembangan - lihat bagian 11.)</w:t>
+        <w:t xml:space="preserve">Penyimpanan permanen (tersimpan di database) dan berlaku otomatis: pesan dari nomor blacklist akan dihapus dan pengirimnya diberi peringatan (perlu bot sebagai admin grup).</w:t>
       </w:r>
     </w:p>
     <w:p>
@@ -2080,7 +2096,7 @@
         <w:spacing w:before="0" w:after="60"/>
       </w:pPr>
       <w:r>
-        <w:t xml:space="preserve">•  .setppgc - mengubah foto profil grup (reply sebuah gambar, lalu ketik .setppgc).</w:t>
+        <w:t xml:space="preserve">•  .setppgc - mengubah foto profil grup (kirim atau reply sebuah gambar, lalu ketik .setppgc).</w:t>
       </w:r>
     </w:p>
     <w:p>
@@ -2407,7 +2423,7 @@
         <w:spacing w:before="0" w:after="60"/>
       </w:pPr>
       <w:r>
-        <w:t xml:space="preserve">•  6. Admin bisa mengecek pendapatan kapan saja dengan .dataordernow (hari ini) atau .dataorderlast (kemarin).</w:t>
+        <w:t xml:space="preserve">•  6. Admin bisa mengecek pendapatan kapan saja dengan .dataordernow (hari ini, berupa PDF) atau .dataorderlast (kemarin, PDF).</w:t>
       </w:r>
     </w:p>
     <w:p>
@@ -2452,39 +2468,23 @@
         <w:spacing w:before="0" w:after="100"/>
       </w:pPr>
       <w:r>
-        <w:t xml:space="preserve">Bot menjalankan pemeriksaan otomatis setiap 5 menit untuk:</w:t>
-      </w:r>
-    </w:p>
-    <w:p>
-      <w:pPr>
-        <w:spacing w:before="0" w:after="60"/>
-      </w:pPr>
-      <w:r>
-        <w:t xml:space="preserve">•  Mengecek masa sewa setiap grup.</w:t>
-      </w:r>
-    </w:p>
-    <w:p>
-      <w:pPr>
-        <w:spacing w:before="0" w:after="60"/>
-      </w:pPr>
-      <w:r>
-        <w:t xml:space="preserve">•  Mengirim pengingat bila sewa grup memasuki masa tenggang (pesan "sewa akan berakhir").</w:t>
-      </w:r>
-    </w:p>
-    <w:p>
-      <w:pPr>
-        <w:spacing w:before="0" w:after="60"/>
-      </w:pPr>
-      <w:r>
-        <w:t xml:space="preserve">•  Mengirim pemberitahuan bila sewa grup berakhir sepenuhnya dan data dihapus.</w:t>
-      </w:r>
-    </w:p>
-    <w:p>
-      <w:pPr>
-        <w:spacing w:before="0" w:after="60"/>
-      </w:pPr>
-      <w:r>
-        <w:t xml:space="preserve">•  Membuat backup database otomatis.</w:t>
+        <w:t xml:space="preserve">Bot menjalankan pemeriksaan otomatis:</w:t>
+      </w:r>
+    </w:p>
+    <w:p>
+      <w:pPr>
+        <w:spacing w:before="0" w:after="60"/>
+      </w:pPr>
+      <w:r>
+        <w:t xml:space="preserve">•  Setiap 5 menit: mengecek masa sewa setiap grup, mengirim pengingat bila sewa memasuki masa tenggang ("sewa akan berakhir"), memberi tahu bila sewa berakhir &amp; data dihapus, serta membuat backup database otomatis.</w:t>
+      </w:r>
+    </w:p>
+    <w:p>
+      <w:pPr>
+        <w:spacing w:before="0" w:after="60"/>
+      </w:pPr>
+      <w:r>
+        <w:t xml:space="preserve">•  Setiap 1 menit: menjalankan jadwal autoopen/autoclose (buka/tutup grup otomatis) tepat pada jam HH:MM yang diatur.</w:t>
       </w:r>
     </w:p>
     <w:p>
@@ -2622,47 +2622,15 @@
         <w:spacing w:before="0" w:after="100"/>
       </w:pPr>
       <w:r>
-        <w:t xml:space="preserve">Sebagian command sudah terdaftar dan membalas, namun penyimpanan/aksinya belum sepenuhnya aktif. Mohon tidak dijadikan janji ke pelanggan sebelum diumumkan siap:</w:t>
-      </w:r>
-    </w:p>
-    <w:p>
-      <w:pPr>
-        <w:spacing w:before="0" w:after="60"/>
-      </w:pPr>
-      <w:r>
-        <w:t xml:space="preserve">•  Blacklist (.addblacklist, .editblacklist, .deleteblacklist, .viewblacklist) - penyimpanan permanen belum aktif.</w:t>
-      </w:r>
-    </w:p>
-    <w:p>
-      <w:pPr>
-        <w:spacing w:before="0" w:after="60"/>
-      </w:pPr>
-      <w:r>
-        <w:t xml:space="preserve">•  .autoopen / .autoopenset / .autoclose / .autocloseset - penjadwalan nyata belum aktif.</w:t>
-      </w:r>
-    </w:p>
-    <w:p>
-      <w:pPr>
-        <w:spacing w:before="0" w:after="60"/>
-      </w:pPr>
-      <w:r>
-        <w:t xml:space="preserve">•  .setppgc - belum benar-benar mengubah foto profil grup.</w:t>
-      </w:r>
-    </w:p>
-    <w:p>
-      <w:pPr>
-        <w:spacing w:before="0" w:after="60"/>
-      </w:pPr>
-      <w:r>
-        <w:t xml:space="preserve">•  Laporan .dataordernow/.dataorderlast berformat TEKS (belum berupa PDF).</w:t>
-      </w:r>
-    </w:p>
-    <w:p>
-      <w:pPr>
-        <w:spacing w:before="0" w:after="100"/>
-      </w:pPr>
-      <w:r>
-        <w:t xml:space="preserve">Fitur yang sudah berfungsi penuh antara lain: menu, sewa, katalog (tambah/ubah/rename/hapus + foto), import/export katalog, template proses/done/open/close/welcome/goodbye, open/close grup, hidetag, kick/promote/demote/add, link/reset link, deletemsg, anti-private-chat, data order &amp; pendapatan (pencatatan otomatis + OCR bukti transfer + laporan harian), dan notifikasi sewa otomatis.</w:t>
+        <w:t xml:space="preserve">Seluruh fitur utama sudah aktif dan berfungsi penuh: menu, sewa, katalog (tambah/ubah/rename/hapus + foto), import/export katalog, template proses/done/open/close/welcome/goodbye, open/close grup, jadwal autoopen/autoclose (buka/tutup grup otomatis), hidetag, kick/promote/demote/add, link/reset link, deletemsg, blacklist grup (penyimpanan permanen + penegakan otomatis), setppgc (ganti foto profil grup), anti-private-chat, data order &amp; pendapatan (pencatatan otomatis + OCR bukti transfer + laporan harian PDF), dan notifikasi sewa otomatis.</w:t>
+      </w:r>
+    </w:p>
+    <w:p>
+      <w:pPr>
+        <w:spacing w:before="0" w:after="100"/>
+      </w:pPr>
+      <w:r>
+        <w:t xml:space="preserve">Catatan: kualitas OCR tergantung kejelasan foto bukti transfer. Bila gagal terbaca, admin cukup mengetik nominal secara manual (mis. .d 50000).</w:t>
       </w:r>
     </w:p>
     <w:p>

</xml_diff>

<commit_message>
docs: regenerasi PANDUAN_BOT (laporan Excel harian/mingguan/bulanan)
</commit_message>
<xml_diff>
--- a/PANDUAN_BOT.docx
+++ b/PANDUAN_BOT.docx
@@ -1620,23 +1620,63 @@
         <w:spacing w:before="0" w:after="60"/>
       </w:pPr>
       <w:r>
-        <w:t xml:space="preserve">•  .dataorder on|off - bila ON, bot otomatis mengirim ringkasan order hari ini setiap kali .close.</w:t>
-      </w:r>
-    </w:p>
-    <w:p>
-      <w:pPr>
-        <w:spacing w:before="0" w:after="60"/>
-      </w:pPr>
-      <w:r>
-        <w:t xml:space="preserve">•  .dataordernow - mengirim laporan order HARI INI sebagai FILE PDF (2 kolom, 15 order per halaman A4).</w:t>
-      </w:r>
-    </w:p>
-    <w:p>
-      <w:pPr>
-        <w:spacing w:before="0" w:after="60"/>
-      </w:pPr>
-      <w:r>
-        <w:t xml:space="preserve">•  .dataorderlast - mengirim laporan order KEMARIN sebagai PDF.</w:t>
+        <w:t xml:space="preserve">•  .dataorder on|off - bila ON, bot otomatis mengirim ringkasan order hari ini setiap kali .close (berupa teks).</w:t>
+      </w:r>
+    </w:p>
+    <w:p>
+      <w:pPr>
+        <w:spacing w:before="0" w:after="60"/>
+      </w:pPr>
+      <w:r>
+        <w:t xml:space="preserve">•  Laporan Excel (.xlsx) - file berisi 2 sheet: "Detail Order" &amp; "Ringkasan Harian":</w:t>
+      </w:r>
+    </w:p>
+    <w:p>
+      <w:pPr>
+        <w:spacing w:before="0" w:after="100"/>
+      </w:pPr>
+      <w:r>
+        <w:t xml:space="preserve">  - .dataordernow - hari ini</w:t>
+      </w:r>
+    </w:p>
+    <w:p>
+      <w:pPr>
+        <w:spacing w:before="0" w:after="100"/>
+      </w:pPr>
+      <w:r>
+        <w:t xml:space="preserve">  - .dataorderlast - kemarin</w:t>
+      </w:r>
+    </w:p>
+    <w:p>
+      <w:pPr>
+        <w:spacing w:before="0" w:after="100"/>
+      </w:pPr>
+      <w:r>
+        <w:t xml:space="preserve">  - .dataorderweek - minggu ini (Senin-Minggu)</w:t>
+      </w:r>
+    </w:p>
+    <w:p>
+      <w:pPr>
+        <w:spacing w:before="0" w:after="100"/>
+      </w:pPr>
+      <w:r>
+        <w:t xml:space="preserve">  - .dataorderlastweek - minggu lalu</w:t>
+      </w:r>
+    </w:p>
+    <w:p>
+      <w:pPr>
+        <w:spacing w:before="0" w:after="100"/>
+      </w:pPr>
+      <w:r>
+        <w:t xml:space="preserve">  - .dataordermonth - bulan ini</w:t>
+      </w:r>
+    </w:p>
+    <w:p>
+      <w:pPr>
+        <w:spacing w:before="0" w:after="100"/>
+      </w:pPr>
+      <w:r>
+        <w:t xml:space="preserve">  - .dataorderlastmonth - bulan lalu</w:t>
       </w:r>
     </w:p>
     <w:p>
@@ -2423,7 +2463,7 @@
         <w:spacing w:before="0" w:after="60"/>
       </w:pPr>
       <w:r>
-        <w:t xml:space="preserve">•  6. Admin bisa mengecek pendapatan kapan saja dengan .dataordernow (hari ini, berupa PDF) atau .dataorderlast (kemarin, PDF).</w:t>
+        <w:t xml:space="preserve">•  6. Admin bisa mengecek pendapatan kapan saja dengan laporan Excel: .dataordernow (hari ini), .dataorderlast (kemarin), .dataorderweek (minggu ini), atau .dataordermonth (bulan ini).</w:t>
       </w:r>
     </w:p>
     <w:p>
@@ -2622,7 +2662,7 @@
         <w:spacing w:before="0" w:after="100"/>
       </w:pPr>
       <w:r>
-        <w:t xml:space="preserve">Seluruh fitur utama sudah aktif dan berfungsi penuh: menu, sewa, katalog (tambah/ubah/rename/hapus + foto), import/export katalog, template proses/done/open/close/welcome/goodbye, open/close grup, jadwal autoopen/autoclose (buka/tutup grup otomatis), hidetag, kick/promote/demote/add, link/reset link, deletemsg, blacklist grup (penyimpanan permanen + penegakan otomatis), setppgc (ganti foto profil grup), anti-private-chat, data order &amp; pendapatan (pencatatan otomatis + OCR bukti transfer + laporan harian PDF), dan notifikasi sewa otomatis.</w:t>
+        <w:t xml:space="preserve">Seluruh fitur utama sudah aktif dan berfungsi penuh: menu, sewa, katalog (tambah/ubah/rename/hapus + foto), import/export katalog, template proses/done/open/close/welcome/goodbye, open/close grup, jadwal autoopen/autoclose (buka/tutup grup otomatis), hidetag, kick/promote/demote/add, link/reset link, deletemsg, blacklist grup (penyimpanan permanen + penegakan otomatis), setppgc (ganti foto profil grup), anti-private-chat, data order &amp; pendapatan (pencatatan otomatis + OCR bukti transfer + laporan Excel harian/mingguan/bulanan), dan notifikasi sewa otomatis.</w:t>
       </w:r>
     </w:p>
     <w:p>

</xml_diff>